<commit_message>
Preserve design baseline before formal contest construction
</commit_message>
<xml_diff>
--- a/docs/彼岸物理规律发现挑战赛_赛题说明.docx
+++ b/docs/彼岸物理规律发现挑战赛_赛题说明.docx
@@ -428,7 +428,7 @@
         </w:numPr>
       </w:pPr>
       <w:r>
-        <w:t>任务包说明任务、拓扑、输入输出、坐标单位、公开噪声规则与候选函数接口。可见天体的初态及已公开属性作为已知输入；这不包含隐藏源的数量、状态或未公开的源强等属性，也不提供未来真实背景轨迹。</w:t>
+        <w:t xml:space="preserve">任务包说明任务、拓扑、输入输出、坐标单位、公开噪声规则和 law_api 版本；存在源侧控制时，明确其可见目标 ID。可见天体初态及已公开属性作为已知输入；不包含真实隐藏源或未公开源强，也不提供未来真实背景轨迹。</w:t>
       </w:r>
     </w:p>
     <w:p>
@@ -2625,7 +2625,7 @@
     </w:p>
     <w:p>
       <w:r>
-        <w:t xml:space="preserve">每个宇宙必须提交可执行预测程序 law.py 和 claims.json；report.md 可选。程序与结构化声明作为同一份有效草稿配对保存，只有前两者决定分数。</w:t>
+        <w:t xml:space="preserve">每个宇宙必须提交 law.py 和 claims.json；report.md 可选。规律代码与结构化声明作为同一份有效草稿配对冻结；错误提交不覆盖上一份有效配对。程序/文件样式不另计分。</w:t>
       </w:r>
     </w:p>
     <w:p>
@@ -2633,7 +2633,7 @@
         <w:pStyle w:val="3"/>
       </w:pPr>
       <w:r>
-        <w:t xml:space="preserve">law.py：调用固定积分器，返回预测轨迹</w:t>
+        <w:t xml:space="preserve">law.py：定义候选加速度，由固定积分器推演</w:t>
       </w:r>
       <w:r>
         <w:t/>
@@ -2644,17 +2644,21 @@
         <w:pStyle w:val="Code"/>
       </w:pPr>
       <w:r>
-        <w:t xml:space="preserve"># 逻辑示意；正式函数签名以冻结 SDK 为准</w:t>
+        <w:t xml:space="preserve"># 接口示例；零加速度不代表正式宇宙规律</w:t>
         <w:br/>
-        <w:t xml:space="preserve">def predict(test_case):</w:t>
+        <w:t xml:space="preserve">import numpy as np</w:t>
         <w:br/>
-        <w:t xml:space="preserve">    # 使用本组确定的规律和参数</w:t>
+        <w:t xml:space="preserve">LAW_API_VERSION = "1.0.0"</w:t>
         <w:br/>
-        <w:t xml:space="preserve">    # 调用官方固定积分器，从传入初态推演</w:t>
+        <w:t xml:space="preserve">PARAMS = {}       # 至多5个已确定的全局有限标量</w:t>
         <w:br/>
-        <w:t xml:space="preserve">    # 返回指定时刻的探针位置数组</w:t>
+        <w:t xml:space="preserve">BODY_PROPS = {}   # 可选：可见对象的未知属性</w:t>
         <w:br/>
-        <w:t xml:space="preserve">    ...</w:t>
+        <w:t xml:space="preserve">HIDDEN = []       # 可选：候选隐藏对象及t=0初态</w:t>
+        <w:br/>
+        <w:t xml:space="preserve">def acceleration(t, bodies, params):</w:t>
+        <w:br/>
+        <w:t xml:space="preserve">    return np.zeros((len(bodies), 2), dtype=np.float64)</w:t>
         <w:t xml:space="preserve"/>
         <w:t xml:space="preserve"/>
         <w:t xml:space="preserve"/>
@@ -2662,6 +2666,11 @@
         <w:t xml:space="preserve"/>
         <w:t xml:space="preserve"/>
         <w:t xml:space="preserve"/>
+        <w:t xml:space="preserve"/>
+        <w:t xml:space="preserve"/>
+        <w:t xml:space="preserve"/>
+        <w:t xml:space="preserve"/>
+        <w:t xml:space="preserve"/>
       </w:r>
     </w:p>
     <w:p>
@@ -2673,7 +2682,7 @@
         </w:numPr>
       </w:pPr>
       <w:r>
-        <w:t xml:space="preserve">参数拟合、优化和符号回归由攻坚组使用允许观测自行完成，指挥部不在隐藏测试上代拟合。程序在评测时接收验证初态、公开属性和合法时刻，调用冻结的 rift.rollout() 返回轨迹。候选背景从公开 t=0 初态推进，在 t_launch 加入探针；不提供真实未来背景或隐藏源真值。开发、拟合时的本地推演不扣能量，但消耗本队算力与探索墙钟。只评探针轨迹。</w:t>
+        <w:t xml:space="preserve">攻坚组自行拟合候选参数；用候选规律生成轨迹时，调用公开固定 rift.rollout(law, case)，与已有观测比较。该本地推演不查询真实宇宙、不扣实验额度，但消耗本队算力和探索墙钟。真实 observe/launch 实验仍由指挥部私有模拟器积分。最终指挥部加载 law.py，由官方驱动调用同一固定积分器产生测试轨迹，不使用队伍自带积分器或预计算轨迹；不在隐藏测试上替队伍拟合。</w:t>
       </w:r>
     </w:p>
     <w:p>
@@ -2700,10 +2709,10 @@
         <w:rPr>
           <w:rStyle w:val="CodeChar"/>
         </w:rPr>
-        <w:t xml:space="preserve">acceleration</w:t>
-      </w:r>
-      <w:r>
-        <w:t xml:space="preserve"> 须是确定性的纯函数；允许使用 NumPy、SciPy 的科学计算功能，不限于 scipy.special.k1。不得借库接口读写文件、联网或访问其他外部状态。科学库许可不改变官方 rift.rollout() 与终评使用统一数值实现的要求。</w:t>
+        <w:t xml:space="preserve">acceleration 为确定性数学函数，可用 math、NumPy、SciPy；不读写文件、联网或依赖随机/外部可变状态。bodies 含只读 id、kind、pos、vel、properties，params 只读；返回与本次对象顺序等长的 (N_body,2) 有限实加速度。正常 list/tuple/实数数组统一为 float64。细则、预检命令和可运行示例见 docs/LAW_API.txt、law_api.json 及 examples。</w:t>
+      </w:r>
+      <w:r>
+        <w:t xml:space="preserve"/>
       </w:r>
     </w:p>
     <w:p>
@@ -2819,7 +2828,7 @@
           </w:tcPr>
           <w:p>
             <w:r>
-              <w:t xml:space="preserve">作用决定速度填 1、决定加速度填 2。此项是科学声明，不改变统一预测程序接口；程序仍须调用固定积分器返回轨迹。</w:t>
+              <w:t xml:space="preserve">作用决定速度填 1、决定加速度填 2。此项是科学声明，不切换加速度接口或求解器；指挥部仍使用固定积分器推演。</w:t>
             </w:r>
           </w:p>
         </w:tc>
@@ -2946,7 +2955,7 @@
         </w:numPr>
       </w:pPr>
       <w:r>
-        <w:t xml:space="preserve">save_draft() 和 submit() 须先做公开格式及接口检查，以 JSON 路径返回明确错误，不用隐藏真值判断科学正确性。错误提交不覆盖最后一份有效的 law.py/claims.json 配对，也不结束探索；通过格式检查不保证科学得分。实现状态：Schema、示例和本地预检器已提供；指挥部私有试做控制台与计分原型已运行，正式 SDK 和隔离部署仍待验收。</w:t>
+        <w:t xml:space="preserve">save_draft() 和 submit() 先做公开格式/接口检查，以 code、path、message 报错，不用隐藏真值判断科学正确性。law.py/claims.json 双方通过后配对冻结；坏提交保留上一份有效配对且不结束探索。静态预检及显式本地运行检查已提供，格式通过不保证科学得分；正式控制台、权限和远端环境仍待集成验收。</w:t>
       </w:r>
     </w:p>
     <w:p>
@@ -3125,7 +3134,7 @@
           </w:tcPr>
           <w:p>
             <w:r>
-              <w:t xml:space="preserve">指挥部运行 law.py，传入预先固定、未提前公开的验证初态和时刻；程序调用固定积分器返回至少 20 枚探针的预测轨迹。各组测试集相同，不按探索历史另选；空间、属性与时间覆盖按机制校准。</w:t>
+              <w:t xml:space="preserve">指挥部加载最终 law.py，将允许的验证初态和时刻交给官方固定推演驱动；驱动调用候选加速度，生成至少20枚探针的预测轨迹。各组使用相同测试集；覆盖按机制校准，不按探索历史另选。</w:t>
             </w:r>
           </w:p>
         </w:tc>
@@ -3598,7 +3607,7 @@
           <w:rStyle w:val="CodeChar"/>
         </w:rPr>
         <w:lastRenderedPageBreak/>
-        <w:t xml:space="preserve">law.py 在单独进程中接收允许的测试输入，调用指挥部锁定的官方积分器返回预测轨迹，不能读写文件；不接收内部测试标签或评分真值。推演超时或报错，该宇宙预言分记 0。</w:t>
+        <w:t xml:space="preserve">独立候选进程加载 law.py；指挥部固定驱动在积分中调用其加速度函数，候选不接收真实隐藏状态、未来真值或内部测试标签。候选计算报错/无效输出按既有规则处理；官方测试配置、参考时间/形状或基础设施错误应修复重评，不直接算队伍预言分0。</w:t>
       </w:r>
       <w:r>
         <w:t xml:space="preserve"/>

</xml_diff>

<commit_message>
Add public contest SDK, submission workflow, and updated rules
</commit_message>
<xml_diff>
--- a/docs/彼岸物理规律发现挑战赛_赛题说明.docx
+++ b/docs/彼岸物理规律发现挑战赛_赛题说明.docx
@@ -372,7 +372,7 @@
         </w:numPr>
       </w:pPr>
       <w:r>
-        <w:t>提交与冻结：开发期可反复提交容器镜像和一页技术说明。镜像内含智能体代码、推理配置，以及白名单权重编号或基于白名单自训的权重。截止时仍无一次有效正式提交，记 0 分。</w:t>
+        <w:t>提交与冻结：开发期可反复提交容器镜像和一页技术说明。镜像内含智能体、推理配置及白名单权重编号或自训权重。以成功受理时间判断截止；截止前受理的版本可在截止后评完。指挥部基础设施故障保留原版本，修复后重评；截止时无有效正式提交记0分。</w:t>
       </w:r>
     </w:p>
     <w:p>
@@ -1886,7 +1886,7 @@
     </w:p>
     <w:p>
       <w:r>
-        <w:t>微调数据可来自按公开协议取得的控制台观测、各攻坚组自己编写的模拟器，以及白名单模型自己的输出；正式九宇宙模拟器源码不公开。训练代码和数据生成脚本须随镜像提交，以备复现核查。</w:t>
+        <w:t>微调数据可来自按公开协议取得的控制台观测、各攻坚组自编模拟器及白名单模型输出；正式九宇宙模拟器源码不公开。允许保留、复用本队合法观测、候选规律和白名单模型成果，供后续开发与提交。各次仍新建独立会话、配额和完整成绩，不拼接历史得分。归还本队自产数据不包含隐藏真值、分项和内部日志；训练及数据生成脚本须随镜像提交备查。</w:t>
       </w:r>
     </w:p>
     <w:p>
@@ -2955,7 +2955,7 @@
         </w:numPr>
       </w:pPr>
       <w:r>
-        <w:t xml:space="preserve">save_draft() 和 submit() 先做公开格式/接口检查，以 code、path、message 报错，不用隐藏真值判断科学正确性。law.py/claims.json 双方通过后配对冻结；坏提交保留上一份有效配对且不结束探索。静态预检及显式本地运行检查已提供，格式通过不保证科学得分；正式控制台、权限和远端环境仍待集成验收。</w:t>
+        <w:t xml:space="preserve">save_draft()和submit()先做公开格式/接口检查，以code、path、message报错，不判科学正误。law.py/claims.json双方通过后配对冻结；坏提交保留上一有效配对且不结束探索。客户端、会话与九宇宙调度、队列和榜单已有本地工程实现；格式通过不保证科学得分，正式Linux权限、镜像、GPU和容量仍须验收。</w:t>
       </w:r>
     </w:p>
     <w:p>
@@ -3221,7 +3221,7 @@
     </w:p>
     <w:p>
       <w:r>
-        <w:t xml:space="preserve">采用预先固定的至少 N = 20 枚隐藏验证探针。九宇宙共用 T 个等间隔相对时刻 τ_k = kD/T（k=1…T），绝对时刻为 t_launch + τ_k；起始时刻和跨度 D 可按宇宙不同，但均须网格对齐。T 是采样数。MSE = (1/(N×T))Σ[(x_pred−x_true)²+(y_pred−y_true)²]，按探针与时刻等权，不除以坐标数2，不开平方。真值不叠加观测噪声；以全部N×T个真值位置的二维均值为中心，V = (1/(N×T))Σ||r_true−r_mean||²，e = MSE / max(V,10⁻¹²)。</w:t>
+        <w:t xml:space="preserve">采用预先固定的至少 N = 20 枚隐藏验证探针。九宇宙共用 T 个等间隔相对时刻 τ_k = kD/T（k=1…T），绝对时刻为 t_launch + τ_k；起始时刻和跨度 D 可按宇宙不同，但均须网格对齐。T 是采样数。MSE = (1/(N×T))Σ[(x_pred−x_true)²+(y_pred−y_true)²]，按探针与时刻等权，不除以坐标数2。真值不叠加观测噪声；以全部N×T个真值位置的二维均值为中心，V = (1/(N×T))Σ||r_true−r_mean||²，e = MSE / max(V,10⁻¹²)。</w:t>
       </w:r>
     </w:p>
     <w:p>
@@ -3229,12 +3229,12 @@
         <w:pStyle w:val="Code"/>
       </w:pPr>
       <w:r>
-        <w:t>P = 80 / (1 + 10e)</w:t>
-      </w:r>
-    </w:p>
-    <w:p>
-      <w:r>
-        <w:t>预言分随误差连续降低，无分档或满分平台；e=0得80，e=0.01约72.73，e=0.1得40。测试轨迹不公开，不保证每个属性取值都未被某队探索过；具体验证空间、时间范围及公开粒度待讨论后冻结，不统一要求“两倍距离”；逐宇宙选样依据不公开。缺失样本、形状错误、非有限数值、积分失败、报错或超时使本宇宙预言分为0，不丢弃坏点重算；误差与分项仅内部留存。</w:t>
+        <w:t>P = 80 / (1 + 5e)</w:t>
+      </w:r>
+    </w:p>
+    <w:p>
+      <w:r>
+        <w:t>预言分随误差连续降低，无分档或满分平台；e=0得80，e=0.01约76.19，e=0.1约53.33，e=0.2得40。测试轨迹不公开，不保证每个属性取值都未被某队探索过；具体验证空间、时间范围及公开粒度待讨论后冻结，不统一要求“两倍距离”；逐宇宙选样依据不公开。缺失样本、形状错误、非有限数值、积分失败、报错或超时使本宇宙预言分为0，不丢弃坏点重算；误差与分项仅内部留存。</w:t>
       </w:r>
     </w:p>
     <w:p>
@@ -3349,7 +3349,7 @@
         </w:numPr>
       </w:pPr>
       <w:r>
-        <w:t>对外仅报告加权总分和各宇宙总分。榜单与最终结算采用最高一次完整提交；按加权均分从高到低排名，同分只比较内部计算的95% bootstrap区间长度，较小者排前；仍相同则并列。区间、分项及判定不随评测反馈返回。</w:t>
+        <w:t>对外仅报告加权总分和各宇宙总分。榜单与最终结算采用最高一次完整提交；按加权均分从高到低排名。同分则比较各宇宙加权节约分，节约分低者排名靠前，仍相同则并列，不重跑模型或实验。分项、加权节约分及判定不随评测反馈返回。</w:t>
       </w:r>
     </w:p>
     <w:p>
@@ -3655,7 +3655,7 @@
         </w:numPr>
       </w:pPr>
       <w:r>
-        <w:t>每次有效正式提交中，各宇宙各运行一次。同分比较只使用该次已有的九个宇宙得分：每档从三个分数中有放回抽取三个，穷举三档联合的19683种等权采样，按30%、40%、30%汇总；取2.5%与97.5%的线性插值百分位之差。不重跑模型或观测实验。</w:t>
+        <w:t>每次有效正式提交中，各宇宙各运行一次。同分比较只使用该次已有的九个宇宙节约分：先求各档三个宇宙节约分的均值，再按30%、40%、30%汇总。只在加权总分完全相同后比较，汇总值较低者靠前，仍相同则并列；不重跑模型或观测实验。该汇总值只在指挥部内部留存。</w:t>
       </w:r>
     </w:p>
     <w:p>

</xml_diff>

<commit_message>
Synchronize prediction scoring contracts and documents to 10e
</commit_message>
<xml_diff>
--- a/docs/彼岸物理规律发现挑战赛_赛题说明.docx
+++ b/docs/彼岸物理规律发现挑战赛_赛题说明.docx
@@ -3229,12 +3229,12 @@
         <w:pStyle w:val="Code"/>
       </w:pPr>
       <w:r>
-        <w:t>P = 80 / (1 + 5e)</w:t>
-      </w:r>
-    </w:p>
-    <w:p>
-      <w:r>
-        <w:t>预言分随误差连续降低，无分档或满分平台；e=0得80，e=0.01约76.19，e=0.1约53.33，e=0.2得40。测试轨迹不公开，不保证每个属性取值都未被某队探索过；具体验证空间、时间范围及公开粒度待讨论后冻结，不统一要求“两倍距离”；逐宇宙选样依据不公开。缺失样本、形状错误、非有限数值、积分失败、报错或超时使本宇宙预言分为0，不丢弃坏点重算；误差与分项仅内部留存。</w:t>
+        <w:t>P = 80 / (1 + 10e)</w:t>
+      </w:r>
+    </w:p>
+    <w:p>
+      <w:r>
+        <w:t>预言分随误差连续降低，无分档或满分平台；e=0得80，e=0.01约72.73，e=0.1得40，e=0.2约26.67。测试轨迹不公开，不保证每个属性取值都未被某队探索过；具体验证空间、时间范围及公开粒度待讨论后冻结，不统一要求“两倍距离”；逐宇宙选样依据不公开。缺失样本、形状错误、非有限数值、积分失败、报错或超时使本宇宙预言分为0，不丢弃坏点重算；误差与分项仅内部留存。</w:t>
       </w:r>
     </w:p>
     <w:p>

</xml_diff>